<commit_message>
Update Assignment 4 report
</commit_message>
<xml_diff>
--- a/documents/Assignment_4.docx
+++ b/documents/Assignment_4.docx
@@ -23480,7 +23480,7 @@
           <w:noProof/>
         </w:rPr>
         <w:drawing>
-          <wp:inline distT="0" distB="0" distL="0" distR="0" wp14:anchorId="0418795F" wp14:editId="494045FE">
+          <wp:inline distT="0" distB="0" distL="0" distR="0" wp14:anchorId="0418795F" wp14:editId="25F8B44B">
             <wp:extent cx="5731510" cy="1908175"/>
             <wp:effectExtent l="0" t="0" r="2540" b="0"/>
             <wp:docPr id="2004789128" name="Picture 2"/>
@@ -50343,6 +50343,7 @@
           <w:lang w:val="vi-VN"/>
         </w:rPr>
       </w:pPr>
+      <w:bookmarkStart w:id="79" w:name="_Hlk243238094"/>
       <w:r>
         <w:rPr>
           <w:rFonts w:ascii="Times New Roman" w:eastAsia="Times New Roman" w:hAnsi="Times New Roman"/>
@@ -50351,6 +50352,7 @@
         <w:t>AWS Academy Data Engineering, Capstone project: submitted, score 20/25, 17 October 2026, 12:26 am. Task 1 lost 5 marks only because the grader looks for an AWS Cloud9 environment that the lab account is not permitted to create (explicit deny); all other checks passed.</w:t>
       </w:r>
     </w:p>
+    <w:bookmarkEnd w:id="79"/>
     <w:p>
       <w:pPr>
         <w:pStyle w:val="ListParagraph"/>
@@ -50653,6 +50655,119 @@
           <w:szCs w:val="24"/>
         </w:rPr>
       </w:pPr>
+      <w:r>
+        <w:rPr>
+          <w:rFonts w:ascii="Times New Roman" w:eastAsia="Times New Roman" w:hAnsi="Times New Roman"/>
+          <w:b/>
+          <w:bCs/>
+          <w:noProof/>
+          <w:sz w:val="24"/>
+          <w:szCs w:val="24"/>
+        </w:rPr>
+        <w:drawing>
+          <wp:inline distT="0" distB="0" distL="0" distR="0" wp14:anchorId="325DC896" wp14:editId="6A8907AF">
+            <wp:extent cx="5731510" cy="3065780"/>
+            <wp:effectExtent l="0" t="0" r="2540" b="1270"/>
+            <wp:docPr id="472181408" name="Picture 2"/>
+            <wp:cNvGraphicFramePr>
+              <a:graphicFrameLocks xmlns:a="http://schemas.openxmlformats.org/drawingml/2006/main" noChangeAspect="1"/>
+            </wp:cNvGraphicFramePr>
+            <a:graphic xmlns:a="http://schemas.openxmlformats.org/drawingml/2006/main">
+              <a:graphicData uri="http://schemas.openxmlformats.org/drawingml/2006/picture">
+                <pic:pic xmlns:pic="http://schemas.openxmlformats.org/drawingml/2006/picture">
+                  <pic:nvPicPr>
+                    <pic:cNvPr id="472181408" name="Picture 472181408"/>
+                    <pic:cNvPicPr/>
+                  </pic:nvPicPr>
+                  <pic:blipFill>
+                    <a:blip r:embed="rId91" cstate="print">
+                      <a:extLst>
+                        <a:ext uri="{28A0092B-C50C-407E-A947-70E740481C1C}">
+                          <a14:useLocalDpi xmlns:a14="http://schemas.microsoft.com/office/drawing/2010/main" val="0"/>
+                        </a:ext>
+                      </a:extLst>
+                    </a:blip>
+                    <a:stretch>
+                      <a:fillRect/>
+                    </a:stretch>
+                  </pic:blipFill>
+                  <pic:spPr>
+                    <a:xfrm>
+                      <a:off x="0" y="0"/>
+                      <a:ext cx="5731510" cy="3065780"/>
+                    </a:xfrm>
+                    <a:prstGeom prst="rect">
+                      <a:avLst/>
+                    </a:prstGeom>
+                  </pic:spPr>
+                </pic:pic>
+              </a:graphicData>
+            </a:graphic>
+          </wp:inline>
+        </w:drawing>
+      </w:r>
+    </w:p>
+    <w:p>
+      <w:pPr>
+        <w:spacing w:after="80"/>
+        <w:jc w:val="both"/>
+        <w:rPr>
+          <w:rFonts w:ascii="Times New Roman" w:eastAsia="Times New Roman" w:hAnsi="Times New Roman"/>
+          <w:b/>
+          <w:bCs/>
+          <w:sz w:val="24"/>
+          <w:szCs w:val="24"/>
+        </w:rPr>
+      </w:pPr>
+      <w:r>
+        <w:rPr>
+          <w:rFonts w:ascii="Times New Roman" w:eastAsia="Times New Roman" w:hAnsi="Times New Roman"/>
+          <w:i/>
+        </w:rPr>
+        <w:t>AWS Academy Data Engineering, Capstone project: submitted, score 20/25, 1</w:t>
+      </w:r>
+      <w:r>
+        <w:rPr>
+          <w:rFonts w:ascii="Times New Roman" w:eastAsia="Times New Roman" w:hAnsi="Times New Roman"/>
+          <w:i/>
+        </w:rPr>
+        <w:t>8</w:t>
+      </w:r>
+      <w:r>
+        <w:rPr>
+          <w:rFonts w:ascii="Times New Roman" w:eastAsia="Times New Roman" w:hAnsi="Times New Roman"/>
+          <w:i/>
+        </w:rPr>
+        <w:t xml:space="preserve"> October 2026, </w:t>
+      </w:r>
+      <w:r>
+        <w:rPr>
+          <w:rFonts w:ascii="Times New Roman" w:eastAsia="Times New Roman" w:hAnsi="Times New Roman"/>
+          <w:i/>
+        </w:rPr>
+        <w:t>07</w:t>
+      </w:r>
+      <w:r>
+        <w:rPr>
+          <w:rFonts w:ascii="Times New Roman" w:eastAsia="Times New Roman" w:hAnsi="Times New Roman"/>
+          <w:i/>
+        </w:rPr>
+        <w:t>:</w:t>
+      </w:r>
+      <w:r>
+        <w:rPr>
+          <w:rFonts w:ascii="Times New Roman" w:eastAsia="Times New Roman" w:hAnsi="Times New Roman"/>
+          <w:i/>
+        </w:rPr>
+        <w:t>33</w:t>
+      </w:r>
+      <w:r>
+        <w:rPr>
+          <w:rFonts w:ascii="Times New Roman" w:eastAsia="Times New Roman" w:hAnsi="Times New Roman"/>
+          <w:i/>
+        </w:rPr>
+        <w:t xml:space="preserve"> am. Task 1 lost 5 marks only because the grader looks for an AWS Cloud9 environment that the lab account is not permitted to create (explicit deny); all other checks passed.</w:t>
+      </w:r>
     </w:p>
     <w:p>
       <w:pPr>
@@ -50708,7 +50823,7 @@
         </w:rPr>
         <w:t xml:space="preserve">Commits: </w:t>
       </w:r>
-      <w:hyperlink r:id="rId91">
+      <w:hyperlink r:id="rId92">
         <w:r>
           <w:rPr>
             <w:rStyle w:val="Hyperlink"/>
@@ -50729,7 +50844,7 @@
         </w:rPr>
         <w:t xml:space="preserve">Pull request #8: </w:t>
       </w:r>
-      <w:hyperlink r:id="rId92">
+      <w:hyperlink r:id="rId93">
         <w:r>
           <w:rPr>
             <w:rStyle w:val="Hyperlink"/>
@@ -50750,7 +50865,7 @@
         </w:rPr>
         <w:t xml:space="preserve">Audit commit: </w:t>
       </w:r>
-      <w:hyperlink r:id="rId93">
+      <w:hyperlink r:id="rId94">
         <w:r>
           <w:rPr>
             <w:rStyle w:val="Hyperlink"/>
@@ -50771,7 +50886,7 @@
         </w:rPr>
         <w:t xml:space="preserve">Audit report: </w:t>
       </w:r>
-      <w:hyperlink r:id="rId94">
+      <w:hyperlink r:id="rId95">
         <w:r>
           <w:rPr>
             <w:rStyle w:val="Hyperlink"/>
@@ -50792,7 +50907,7 @@
         </w:rPr>
         <w:t xml:space="preserve">Jira: </w:t>
       </w:r>
-      <w:hyperlink r:id="rId95">
+      <w:hyperlink r:id="rId96">
         <w:r>
           <w:rPr>
             <w:rStyle w:val="Hyperlink"/>
@@ -51023,7 +51138,7 @@
                     <pic:cNvPicPr/>
                   </pic:nvPicPr>
                   <pic:blipFill>
-                    <a:blip r:embed="rId96"/>
+                    <a:blip r:embed="rId97"/>
                     <a:stretch>
                       <a:fillRect/>
                     </a:stretch>
@@ -51114,7 +51229,7 @@
         </w:rPr>
         <w:t xml:space="preserve">Commits: </w:t>
       </w:r>
-      <w:hyperlink r:id="rId97">
+      <w:hyperlink r:id="rId98">
         <w:r>
           <w:rPr>
             <w:rStyle w:val="Hyperlink"/>
@@ -51135,7 +51250,7 @@
         </w:rPr>
         <w:t xml:space="preserve">Dashboard commit: </w:t>
       </w:r>
-      <w:hyperlink r:id="rId98">
+      <w:hyperlink r:id="rId99">
         <w:r>
           <w:rPr>
             <w:rStyle w:val="Hyperlink"/>
@@ -51156,7 +51271,7 @@
         </w:rPr>
         <w:t xml:space="preserve">Dashboard app: </w:t>
       </w:r>
-      <w:hyperlink r:id="rId99">
+      <w:hyperlink r:id="rId100">
         <w:r>
           <w:rPr>
             <w:rStyle w:val="Hyperlink"/>
@@ -51177,7 +51292,7 @@
         </w:rPr>
         <w:t xml:space="preserve">Portal pages: </w:t>
       </w:r>
-      <w:hyperlink r:id="rId100">
+      <w:hyperlink r:id="rId101">
         <w:r>
           <w:rPr>
             <w:rStyle w:val="Hyperlink"/>
@@ -51198,7 +51313,7 @@
         </w:rPr>
         <w:t xml:space="preserve">Jira issues: </w:t>
       </w:r>
-      <w:hyperlink r:id="rId101">
+      <w:hyperlink r:id="rId102">
         <w:r>
           <w:rPr>
             <w:rStyle w:val="Hyperlink"/>
@@ -51216,7 +51331,7 @@
         </w:rPr>
         <w:t xml:space="preserve"> (dashboard prototype), </w:t>
       </w:r>
-      <w:hyperlink r:id="rId102">
+      <w:hyperlink r:id="rId103">
         <w:r>
           <w:rPr>
             <w:rStyle w:val="Hyperlink"/>
@@ -51287,8 +51402,8 @@
       </w:r>
     </w:p>
     <w:sectPr>
-      <w:headerReference w:type="default" r:id="rId103"/>
-      <w:footerReference w:type="default" r:id="rId104"/>
+      <w:headerReference w:type="default" r:id="rId104"/>
+      <w:footerReference w:type="default" r:id="rId105"/>
       <w:pgSz w:w="11906" w:h="16838" w:code="9"/>
       <w:pgMar w:top="1440" w:right="1440" w:bottom="1440" w:left="1440" w:header="709" w:footer="709" w:gutter="0"/>
       <w:pgNumType w:start="0"/>
@@ -55503,12 +55618,6 @@
 </file>
 
 <file path=customXml/item1.xml><?xml version="1.0" encoding="utf-8"?>
-<p:properties xmlns:p="http://schemas.microsoft.com/office/2006/metadata/properties" xmlns:xsi="http://www.w3.org/2001/XMLSchema-instance" xmlns:pc="http://schemas.microsoft.com/office/infopath/2007/PartnerControls">
-  <documentManagement/>
-</p:properties>
-</file>
-
-<file path=customXml/item2.xml><?xml version="1.0" encoding="utf-8"?>
 <?mso-contentType ?>
 <FormTemplates xmlns="http://schemas.microsoft.com/sharepoint/v3/contenttype/forms">
   <Display>DocumentLibraryForm</Display>
@@ -55517,7 +55626,7 @@
 </FormTemplates>
 </file>
 
-<file path=customXml/item3.xml><?xml version="1.0" encoding="utf-8"?>
+<file path=customXml/item2.xml><?xml version="1.0" encoding="utf-8"?>
 <ct:contentTypeSchema xmlns:ct="http://schemas.microsoft.com/office/2006/metadata/contentType" xmlns:ma="http://schemas.microsoft.com/office/2006/metadata/properties/metaAttributes" ct:_="" ma:_="" ma:contentTypeName="Document" ma:contentTypeID="0x010100922A3CA1EE6E4B44833A16005451862E" ma:contentTypeVersion="3" ma:contentTypeDescription="Create a new document." ma:contentTypeScope="" ma:versionID="b712dade4bf8bf57d4a0cdac4d020ae4">
   <xsd:schema xmlns:xsd="http://www.w3.org/2001/XMLSchema" xmlns:xs="http://www.w3.org/2001/XMLSchema" xmlns:p="http://schemas.microsoft.com/office/2006/metadata/properties" xmlns:ns2="92f6da62-8f25-40d3-824c-47c5f6f94bd6" targetNamespace="http://schemas.microsoft.com/office/2006/metadata/properties" ma:root="true" ma:fieldsID="f6f8642a0533a95cbf7fc7bbc8c1e153" ns2:_="">
     <xsd:import namespace="92f6da62-8f25-40d3-824c-47c5f6f94bd6"/>
@@ -55655,20 +55764,17 @@
 </ct:contentTypeSchema>
 </file>
 
+<file path=customXml/item3.xml><?xml version="1.0" encoding="utf-8"?>
+<p:properties xmlns:p="http://schemas.microsoft.com/office/2006/metadata/properties" xmlns:xsi="http://www.w3.org/2001/XMLSchema-instance" xmlns:pc="http://schemas.microsoft.com/office/infopath/2007/PartnerControls">
+  <documentManagement/>
+</p:properties>
+</file>
+
 <file path=customXml/item4.xml><?xml version="1.0" encoding="utf-8"?>
 <b:Sources xmlns:b="http://schemas.openxmlformats.org/officeDocument/2006/bibliography" xmlns="http://schemas.openxmlformats.org/officeDocument/2006/bibliography" SelectedStyle="\APASixthEditionOfficeOnline.xsl" StyleName="APA" Version="6"/>
 </file>
 
 <file path=customXml/itemProps1.xml><?xml version="1.0" encoding="utf-8"?>
-<ds:datastoreItem xmlns:ds="http://schemas.openxmlformats.org/officeDocument/2006/customXml" ds:itemID="{B2E31085-3E06-4A9F-9730-20A04C85DF24}">
-  <ds:schemaRefs>
-    <ds:schemaRef ds:uri="http://schemas.microsoft.com/office/2006/metadata/properties"/>
-    <ds:schemaRef ds:uri="http://schemas.microsoft.com/office/infopath/2007/PartnerControls"/>
-  </ds:schemaRefs>
-</ds:datastoreItem>
-</file>
-
-<file path=customXml/itemProps2.xml><?xml version="1.0" encoding="utf-8"?>
 <ds:datastoreItem xmlns:ds="http://schemas.openxmlformats.org/officeDocument/2006/customXml" ds:itemID="{82A9BB68-56B4-4822-B6B7-DB471576EB1F}">
   <ds:schemaRefs>
     <ds:schemaRef ds:uri="http://schemas.microsoft.com/sharepoint/v3/contenttype/forms"/>
@@ -55676,7 +55782,7 @@
 </ds:datastoreItem>
 </file>
 
-<file path=customXml/itemProps3.xml><?xml version="1.0" encoding="utf-8"?>
+<file path=customXml/itemProps2.xml><?xml version="1.0" encoding="utf-8"?>
 <ds:datastoreItem xmlns:ds="http://schemas.openxmlformats.org/officeDocument/2006/customXml" ds:itemID="{69960CE0-24F5-4ADF-A12F-FE193FFA9C43}">
   <ds:schemaRefs>
     <ds:schemaRef ds:uri="http://schemas.microsoft.com/office/2006/metadata/contentType"/>
@@ -55694,6 +55800,15 @@
 </ds:datastoreItem>
 </file>
 
+<file path=customXml/itemProps3.xml><?xml version="1.0" encoding="utf-8"?>
+<ds:datastoreItem xmlns:ds="http://schemas.openxmlformats.org/officeDocument/2006/customXml" ds:itemID="{B2E31085-3E06-4A9F-9730-20A04C85DF24}">
+  <ds:schemaRefs>
+    <ds:schemaRef ds:uri="http://schemas.microsoft.com/office/2006/metadata/properties"/>
+    <ds:schemaRef ds:uri="http://schemas.microsoft.com/office/infopath/2007/PartnerControls"/>
+  </ds:schemaRefs>
+</ds:datastoreItem>
+</file>
+
 <file path=customXml/itemProps4.xml><?xml version="1.0" encoding="utf-8"?>
 <ds:datastoreItem xmlns:ds="http://schemas.openxmlformats.org/officeDocument/2006/customXml" ds:itemID="{E3DA75CE-018A-4AF1-8B5C-BF0FBFE76924}">
   <ds:schemaRefs>

</xml_diff>